<commit_message>
Updated document with questions, + user stories
</commit_message>
<xml_diff>
--- a/Software Engineering Work.docx
+++ b/Software Engineering Work.docx
@@ -571,7 +571,67 @@
         <w:rPr>
           <w:rFonts w:ascii="Helvetica" w:hAnsi="Helvetica"/>
         </w:rPr>
-        <w:t>…</w:t>
+        <w:t xml:space="preserve">For each delivery person, what personal details should be included. I.e. should we use names to identify each person or numbers? </w:t>
+      </w:r>
+    </w:p>
+    <w:p>
+      <w:pPr>
+        <w:pStyle w:val="ListParagraph"/>
+        <w:numPr>
+          <w:ilvl w:val="0"/>
+          <w:numId w:val="3"/>
+        </w:numPr>
+        <w:rPr>
+          <w:rFonts w:ascii="Helvetica" w:hAnsi="Helvetica"/>
+        </w:rPr>
+      </w:pPr>
+      <w:r>
+        <w:rPr>
+          <w:rFonts w:ascii="Helvetica" w:hAnsi="Helvetica"/>
+        </w:rPr>
+        <w:t xml:space="preserve">Is there a specific area we should take into account for the system to manage? </w:t>
+      </w:r>
+    </w:p>
+    <w:p>
+      <w:pPr>
+        <w:pStyle w:val="ListParagraph"/>
+        <w:numPr>
+          <w:ilvl w:val="0"/>
+          <w:numId w:val="3"/>
+        </w:numPr>
+        <w:rPr>
+          <w:rFonts w:ascii="Helvetica" w:hAnsi="Helvetica"/>
+        </w:rPr>
+      </w:pPr>
+      <w:r>
+        <w:rPr>
+          <w:rFonts w:ascii="Helvetica" w:hAnsi="Helvetica"/>
+        </w:rPr>
+        <w:t xml:space="preserve">Would the prices of deliveries be consistent, or would different publications have different costs to add to the total bill for a given customer? </w:t>
+      </w:r>
+    </w:p>
+    <w:p>
+      <w:pPr>
+        <w:pStyle w:val="ListParagraph"/>
+        <w:numPr>
+          <w:ilvl w:val="0"/>
+          <w:numId w:val="3"/>
+        </w:numPr>
+        <w:rPr>
+          <w:rFonts w:ascii="Helvetica" w:hAnsi="Helvetica"/>
+        </w:rPr>
+      </w:pPr>
+      <w:r>
+        <w:rPr>
+          <w:rFonts w:ascii="Helvetica" w:hAnsi="Helvetica"/>
+        </w:rPr>
+        <w:t>In regard to</w:t>
+      </w:r>
+      <w:r>
+        <w:rPr>
+          <w:rFonts w:ascii="Helvetica" w:hAnsi="Helvetica"/>
+        </w:rPr>
+        <w:t xml:space="preserve"> the 'customers come and go' section, would it be fair to assume that it is logged when a customer would leave, and then logged again upon their return, or would the user have to input the time the customer would be absent?</w:t>
       </w:r>
     </w:p>
     <w:sectPr>
@@ -1540,7 +1600,6 @@
   <w:style w:type="character" w:default="1" w:styleId="DefaultParagraphFont">
     <w:name w:val="Default Paragraph Font"/>
     <w:uiPriority w:val="1"/>
-    <w:semiHidden/>
     <w:unhideWhenUsed/>
   </w:style>
   <w:style w:type="table" w:default="1" w:styleId="TableNormal">

</xml_diff>